<commit_message>
research: correct stale panel numbers against live DB (Arm A 12 complete, Arm B 7 complete); flag RR-107 unrecognized completer
Co-Authored-By: Claude Opus 4.8 <noreply@anthropic.com>
Claude-Session: https://claude.ai/code/session_01W9UtE7X76spacWeSvBH7tv
</commit_message>
<xml_diff>
--- a/research/submission/Combined_International_Paper.docx
+++ b/research/submission/Combined_International_Paper.docx
@@ -162,7 +162,7 @@
           <w:sz w:val="24"/>
           <w:szCs w:val="24"/>
         </w:rPr>
-        <w:t xml:space="preserve"> Working draft, validation phase. The design, materials, and pre-registered analysis plan are complete. Two supporting rungs are now reported with complete data: cross-vendor reproducibility (three AI providers) and inter-rater reliability (expert and trained panels). The two primary analyses remain gated: the detection panel is partially collected (7 of 24 registered reviewers have completed the full set) and the randomized comparison (Arm B) has enrolled its first participants but has not been run to analysis. No inferential result for the primary analyses is stated until the pre-registered sample and thresholds are met. All figures cited are verified against the study database, not memory.</w:t>
+        <w:t xml:space="preserve"> Working draft, validation phase. The design, materials, and pre-registered analysis plan are complete. Two supporting rungs are now reported with complete data: cross-vendor reproducibility (three AI providers) and inter-rater reliability (expert and trained panels). The two primary analyses remain gated: as of 28 July 2026 the detection panel is partially collected (12 registered reviewers have completed the full set, with others in progress) and the randomized comparison (Arm B) has 7 completed participants (3 in the JRS condition, 4 in the baseline), short of the pre-registered per-arm target and not yet run to analysis. No inferential result for the primary analyses is stated until the pre-registered sample and thresholds are met. All figures cited are verified against the study database, not memory.</w:t>
       </w:r>
     </w:p>
     <w:p>
@@ -917,7 +917,7 @@
           <w:sz w:val="24"/>
           <w:szCs w:val="24"/>
         </w:rPr>
-        <w:t xml:space="preserve">The detection panel is an international group of experienced professionals in relevant domains (AI governance, compliance, audit, human resources, investigations, data privacy, records, and law). As of this draft, 24 reviewers are registered and 7 have completed the full 24-record set, with additional reviewers in progress; the panel spans more than ten countries and multiple professional domains and first languages. Reviewers participate in a personal capacity, without compensation, and are recognized as named contributors with their consent. Participation is voluntary and may be withdrawn before publication.</w:t>
+        <w:t xml:space="preserve">The detection panel is an international group of experienced professionals in relevant domains (AI governance, compliance, audit, human resources, investigations, data privacy, records, and law). As of 28 July 2026, more than 25 reviewers are registered and 12 have completed the full 24-record set, with additional reviewers in progress; the completed reviewers alone span 10 countries on 5 continents and multiple professional domains and first languages. Reviewers participate in a personal capacity, without compensation, and are recognized as named contributors with their consent. Participation is voluntary and may be withdrawn before publication.</w:t>
       </w:r>
     </w:p>
     <w:p>
@@ -1209,7 +1209,7 @@
           <w:sz w:val="24"/>
           <w:szCs w:val="24"/>
         </w:rPr>
-        <w:t xml:space="preserve">Results for the two primary analyses are not reported in this draft. Reporting is conditional on reaching the pre-registered sample with the required spread and on the pre-registered thresholds. The current state is descriptive and directional only: the detection panel is partially collected (7 of 24 registered reviewers complete), and the randomized comparison has enrolled its first participants but has not been run to analysis. No sensitivity, specificity, agreement, or between-condition figure is stated here, because stating one before the pre-registered conditions are met would violate the study's own analysis plan. When complete, this section will report: the cross-tabulation of JRS read against the verified key; sensitivity and specificity with intervals; inter-rater agreement on the detection set; and the B1-versus-B2 comparison against the pre-registered superiority threshold.</w:t>
+        <w:t xml:space="preserve">Results for the two primary analyses are not reported in this draft. Reporting is conditional on reaching the pre-registered sample with the required spread and on the pre-registered thresholds. The current state is descriptive and directional only: as of 28 July 2026 the detection panel is partially collected (12 registered reviewers have completed the full set, with others in progress), and the randomized comparison has enrolled participants, of whom 7 have completed the set (3 in the JRS condition and 4 in the baseline), short of the pre-registered per-arm target and not yet run to analysis. No sensitivity, specificity, agreement, or between-condition figure is stated here, because stating one before the pre-registered conditions are met would violate the study's own analysis plan. When complete, this section will report: the cross-tabulation of JRS read against the verified key; sensitivity and specificity with intervals; inter-rater agreement on the detection set; and the B1-versus-B2 comparison against the pre-registered superiority threshold.</w:t>
       </w:r>
     </w:p>
     <w:p>
@@ -1570,6 +1570,42 @@
           <w:szCs w:val="24"/>
         </w:rPr>
         <w:t xml:space="preserve">2026-07-25 - Integrated the two outreach-campaign framings as academic significance (NOT marketing): added a dual-stakes paragraph to the Introduction (accountability to the person / defensibility for the institution, one and the same defect) and extended the Discussion to state the two-directional implication. This aligns the paper's significance with the two sister campaigns (The Right to Know Why; The Decisions You Can Defend) in substance. Results remain gated; Arm B blind protected; no effectiveness claim; fixed banned "frequently" -&gt; "often"; no long dashes.</w:t>
+      </w:r>
+    </w:p>
+    <w:p>
+      <w:pPr>
+        <w:pStyle w:val="ListParagraph"/>
+        <w:numPr>
+          <w:ilvl w:val="0"/>
+          <w:numId w:val="1"/>
+        </w:numPr>
+        <w:spacing w:after="80"/>
+      </w:pPr>
+      <w:r>
+        <w:rPr>
+          <w:rFonts w:ascii="Times New Roman" w:cs="Times New Roman" w:eastAsia="Times New Roman" w:hAnsi="Times New Roman"/>
+          <w:sz w:val="24"/>
+          <w:szCs w:val="24"/>
+        </w:rPr>
+        <w:t xml:space="preserve">2026-07-28 - </w:t>
+      </w:r>
+      <w:r>
+        <w:rPr>
+          <w:rFonts w:ascii="Times New Roman" w:cs="Times New Roman" w:eastAsia="Times New Roman" w:hAnsi="Times New Roman"/>
+          <w:b/>
+          <w:bCs/>
+          <w:sz w:val="24"/>
+          <w:szCs w:val="24"/>
+        </w:rPr>
+        <w:t xml:space="preserve">PANEL NUMBERS RE-VERIFIED against the live DB</w:t>
+      </w:r>
+      <w:r>
+        <w:rPr>
+          <w:rFonts w:ascii="Times New Roman" w:cs="Times New Roman" w:eastAsia="Times New Roman" w:hAnsi="Times New Roman"/>
+          <w:sz w:val="24"/>
+          <w:szCs w:val="24"/>
+        </w:rPr>
+        <w:t xml:space="preserve"> (`check_completion.py` -&gt; `pilot_progress`/`armb_progress`, 2026-07-28). Corrected the stale "24 registered, 7 complete" carried from the 2026-07-13 draft. Current, DB-verified: detection panel (Arm A) 12 complete of ~26 registered (Niloofar 22/24 in progress), completers spanning 10 countries on 5 continents; Arm B 7 complete (3 JRS condition, 4 baseline), 1 in progress. Updated Sections 4.3 and 5.2. Primary results remain gated. Separately flagged: RR-107 completed but was never logged/recognized.</w:t>
       </w:r>
     </w:p>
     <w:p>

</xml_diff>